<commit_message>
Add Stage 3 AI enrichment and Azure AI Search indexing
</commit_message>
<xml_diff>
--- a/docs/StoreDNA_Pipeline_Local_Development.docx
+++ b/docs/StoreDNA_Pipeline_Local_Development.docx
@@ -98,7 +98,15 @@
                 <w:b/>
                 <w:sz w:val="24"/>
               </w:rPr>
-              <w:t>4. Curate Data — in Cursor</w:t>
+              <w:t>2</w:t>
+            </w:r>
+            <w:r>
+              <w:rPr>
+                <w:rFonts w:ascii="Calibri" w:hAnsi="Calibri"/>
+                <w:b/>
+                <w:sz w:val="24"/>
+              </w:rPr>
+              <w:t>. Curate Data — in Cursor</w:t>
             </w:r>
           </w:p>
           <w:p>
@@ -153,7 +161,15 @@
                 <w:b/>
                 <w:sz w:val="24"/>
               </w:rPr>
-              <w:t>6. AI Enrichment — Azure OpenAI</w:t>
+              <w:t>3</w:t>
+            </w:r>
+            <w:r>
+              <w:rPr>
+                <w:rFonts w:ascii="Calibri" w:hAnsi="Calibri"/>
+                <w:b/>
+                <w:sz w:val="24"/>
+              </w:rPr>
+              <w:t>. AI Enrichment — Azure OpenAI</w:t>
             </w:r>
           </w:p>
           <w:p>
@@ -208,7 +224,15 @@
                 <w:b/>
                 <w:sz w:val="24"/>
               </w:rPr>
-              <w:t>7. Modality Vectors</w:t>
+              <w:t>4</w:t>
+            </w:r>
+            <w:r>
+              <w:rPr>
+                <w:rFonts w:ascii="Calibri" w:hAnsi="Calibri"/>
+                <w:b/>
+                <w:sz w:val="24"/>
+              </w:rPr>
+              <w:t>. Modality Vectors</w:t>
             </w:r>
           </w:p>
           <w:p>
@@ -263,7 +287,15 @@
                 <w:b/>
                 <w:sz w:val="24"/>
               </w:rPr>
-              <w:t>8. StoreDNA Builder</w:t>
+              <w:t>5</w:t>
+            </w:r>
+            <w:r>
+              <w:rPr>
+                <w:rFonts w:ascii="Calibri" w:hAnsi="Calibri"/>
+                <w:b/>
+                <w:sz w:val="24"/>
+              </w:rPr>
+              <w:t>. StoreDNA Builder</w:t>
             </w:r>
           </w:p>
           <w:p>
@@ -318,7 +350,15 @@
                 <w:b/>
                 <w:sz w:val="24"/>
               </w:rPr>
-              <w:t>9. Vector Index — Azure AI Search</w:t>
+              <w:t>6</w:t>
+            </w:r>
+            <w:r>
+              <w:rPr>
+                <w:rFonts w:ascii="Calibri" w:hAnsi="Calibri"/>
+                <w:b/>
+                <w:sz w:val="24"/>
+              </w:rPr>
+              <w:t>. Vector Index — Azure AI Search</w:t>
             </w:r>
           </w:p>
           <w:p>
@@ -373,7 +413,15 @@
                 <w:b/>
                 <w:sz w:val="24"/>
               </w:rPr>
-              <w:t>10. Business Output</w:t>
+              <w:t>7</w:t>
+            </w:r>
+            <w:r>
+              <w:rPr>
+                <w:rFonts w:ascii="Calibri" w:hAnsi="Calibri"/>
+                <w:b/>
+                <w:sz w:val="24"/>
+              </w:rPr>
+              <w:t>. Business Output</w:t>
             </w:r>
           </w:p>
           <w:p>

</xml_diff>